<commit_message>
modified urban environment weight using variables instead of absolutes
</commit_message>
<xml_diff>
--- a/1_PCA/PCA_UQoL_Barcelona.docx
+++ b/1_PCA/PCA_UQoL_Barcelona.docx
@@ -16799,13 +16799,13 @@
         <w:t xml:space="preserve">)     </w:t>
       </w:r>
     </w:p>
-    <w:bookmarkStart w:id="40" w:name="infrastructures-pca"/>
+    <w:bookmarkStart w:id="40" w:name="infrastructures-and-services-pca"/>
     <w:p>
       <w:pPr>
         <w:pStyle w:val="Heading3"/>
       </w:pPr>
       <w:r>
-        <w:t xml:space="preserve">3.3.1 Infrastructures PCA</w:t>
+        <w:t xml:space="preserve">3.3.1 Infrastructures and services PCA</w:t>
       </w:r>
     </w:p>
     <w:p>
@@ -18373,13 +18373,21 @@
       </w:r>
     </w:p>
     <w:bookmarkEnd w:id="40"/>
-    <w:bookmarkStart w:id="41" w:name="infrastructures-weight"/>
+    <w:bookmarkStart w:id="41" w:name="infrastructures-and-services-weight"/>
     <w:p>
       <w:pPr>
         <w:pStyle w:val="Heading3"/>
       </w:pPr>
       <w:r>
-        <w:t xml:space="preserve">3.3.2 Infrastructures weight</w:t>
+        <w:t xml:space="preserve">3.3.2 Infrastructures and services weight</w:t>
+      </w:r>
+    </w:p>
+    <w:p>
+      <w:pPr>
+        <w:pStyle w:val="FirstParagraph"/>
+      </w:pPr>
+      <w:r>
+        <w:t xml:space="preserve">In this case and because of the complexity of numerous indicators, 3 PC are used to retain as much variance as possible.</w:t>
       </w:r>
     </w:p>
     <w:p>
@@ -18388,9 +18396,30 @@
       </w:pPr>
       <w:r>
         <w:rPr>
-          <w:rStyle w:val="NormalTok"/>
-        </w:rPr>
-        <w:t xml:space="preserve">pc1_weights </w:t>
+          <w:rStyle w:val="CommentTok"/>
+        </w:rPr>
+        <w:t xml:space="preserve"># Calculate combined weights of PC1, Pc2 and Pc3</w:t>
+      </w:r>
+      <w:r>
+        <w:br/>
+      </w:r>
+      <w:r>
+        <w:br/>
+      </w:r>
+      <w:r>
+        <w:rPr>
+          <w:rStyle w:val="CommentTok"/>
+        </w:rPr>
+        <w:t xml:space="preserve"># Absolute values for PC1</w:t>
+      </w:r>
+      <w:r>
+        <w:br/>
+      </w:r>
+      <w:r>
+        <w:rPr>
+          <w:rStyle w:val="NormalTok"/>
+        </w:rPr>
+        <w:t xml:space="preserve">weight_PC1_infrastructuresdim </w:t>
       </w:r>
       <w:r>
         <w:rPr>
@@ -18438,10 +18467,367 @@
         <w:rPr>
           <w:rStyle w:val="NormalTok"/>
         </w:rPr>
-        <w:t xml:space="preserve">])</w:t>
-      </w:r>
-      <w:r>
-        <w:br/>
+        <w:t xml:space="preserve">]) </w:t>
+      </w:r>
+      <w:r>
+        <w:br/>
+      </w:r>
+      <w:r>
+        <w:rPr>
+          <w:rStyle w:val="CommentTok"/>
+        </w:rPr>
+        <w:t xml:space="preserve"># Absolute values for PC2</w:t>
+      </w:r>
+      <w:r>
+        <w:br/>
+      </w:r>
+      <w:r>
+        <w:rPr>
+          <w:rStyle w:val="NormalTok"/>
+        </w:rPr>
+        <w:t xml:space="preserve">weight_PC2_infrastructuresdim </w:t>
+      </w:r>
+      <w:r>
+        <w:rPr>
+          <w:rStyle w:val="OtherTok"/>
+        </w:rPr>
+        <w:t xml:space="preserve">&lt;-</w:t>
+      </w:r>
+      <w:r>
+        <w:rPr>
+          <w:rStyle w:val="NormalTok"/>
+        </w:rPr>
+        <w:t xml:space="preserve"> </w:t>
+      </w:r>
+      <w:r>
+        <w:rPr>
+          <w:rStyle w:val="FunctionTok"/>
+        </w:rPr>
+        <w:t xml:space="preserve">abs</w:t>
+      </w:r>
+      <w:r>
+        <w:rPr>
+          <w:rStyle w:val="NormalTok"/>
+        </w:rPr>
+        <w:t xml:space="preserve">(infrastructures_dim_results</w:t>
+      </w:r>
+      <w:r>
+        <w:rPr>
+          <w:rStyle w:val="SpecialCharTok"/>
+        </w:rPr>
+        <w:t xml:space="preserve">$</w:t>
+      </w:r>
+      <w:r>
+        <w:rPr>
+          <w:rStyle w:val="NormalTok"/>
+        </w:rPr>
+        <w:t xml:space="preserve">rotation[, </w:t>
+      </w:r>
+      <w:r>
+        <w:rPr>
+          <w:rStyle w:val="DecValTok"/>
+        </w:rPr>
+        <w:t xml:space="preserve">2</w:t>
+      </w:r>
+      <w:r>
+        <w:rPr>
+          <w:rStyle w:val="NormalTok"/>
+        </w:rPr>
+        <w:t xml:space="preserve">]) </w:t>
+      </w:r>
+      <w:r>
+        <w:br/>
+      </w:r>
+      <w:r>
+        <w:rPr>
+          <w:rStyle w:val="CommentTok"/>
+        </w:rPr>
+        <w:t xml:space="preserve"># Absolute values for PC3</w:t>
+      </w:r>
+      <w:r>
+        <w:br/>
+      </w:r>
+      <w:r>
+        <w:rPr>
+          <w:rStyle w:val="NormalTok"/>
+        </w:rPr>
+        <w:t xml:space="preserve">weight_PC3_infrastructuresdim </w:t>
+      </w:r>
+      <w:r>
+        <w:rPr>
+          <w:rStyle w:val="OtherTok"/>
+        </w:rPr>
+        <w:t xml:space="preserve">&lt;-</w:t>
+      </w:r>
+      <w:r>
+        <w:rPr>
+          <w:rStyle w:val="NormalTok"/>
+        </w:rPr>
+        <w:t xml:space="preserve"> </w:t>
+      </w:r>
+      <w:r>
+        <w:rPr>
+          <w:rStyle w:val="FunctionTok"/>
+        </w:rPr>
+        <w:t xml:space="preserve">abs</w:t>
+      </w:r>
+      <w:r>
+        <w:rPr>
+          <w:rStyle w:val="NormalTok"/>
+        </w:rPr>
+        <w:t xml:space="preserve">(infrastructures_dim_results</w:t>
+      </w:r>
+      <w:r>
+        <w:rPr>
+          <w:rStyle w:val="SpecialCharTok"/>
+        </w:rPr>
+        <w:t xml:space="preserve">$</w:t>
+      </w:r>
+      <w:r>
+        <w:rPr>
+          <w:rStyle w:val="NormalTok"/>
+        </w:rPr>
+        <w:t xml:space="preserve">rotation[, </w:t>
+      </w:r>
+      <w:r>
+        <w:rPr>
+          <w:rStyle w:val="DecValTok"/>
+        </w:rPr>
+        <w:t xml:space="preserve">3</w:t>
+      </w:r>
+      <w:r>
+        <w:rPr>
+          <w:rStyle w:val="NormalTok"/>
+        </w:rPr>
+        <w:t xml:space="preserve">]) </w:t>
+      </w:r>
+      <w:r>
+        <w:br/>
+      </w:r>
+      <w:r>
+        <w:br/>
+      </w:r>
+      <w:r>
+        <w:rPr>
+          <w:rStyle w:val="CommentTok"/>
+        </w:rPr>
+        <w:t xml:space="preserve"># Ponderated according to explicit variance</w:t>
+      </w:r>
+      <w:r>
+        <w:br/>
+      </w:r>
+      <w:r>
+        <w:rPr>
+          <w:rStyle w:val="NormalTok"/>
+        </w:rPr>
+        <w:t xml:space="preserve">variance_PC1 </w:t>
+      </w:r>
+      <w:r>
+        <w:rPr>
+          <w:rStyle w:val="OtherTok"/>
+        </w:rPr>
+        <w:t xml:space="preserve">&lt;-</w:t>
+      </w:r>
+      <w:r>
+        <w:rPr>
+          <w:rStyle w:val="NormalTok"/>
+        </w:rPr>
+        <w:t xml:space="preserve"> var_exp_infrastructures_dim[</w:t>
+      </w:r>
+      <w:r>
+        <w:rPr>
+          <w:rStyle w:val="DecValTok"/>
+        </w:rPr>
+        <w:t xml:space="preserve">1</w:t>
+      </w:r>
+      <w:r>
+        <w:rPr>
+          <w:rStyle w:val="NormalTok"/>
+        </w:rPr>
+        <w:t xml:space="preserve">] </w:t>
+      </w:r>
+      <w:r>
+        <w:br/>
+      </w:r>
+      <w:r>
+        <w:rPr>
+          <w:rStyle w:val="NormalTok"/>
+        </w:rPr>
+        <w:t xml:space="preserve">variance_PC2 </w:t>
+      </w:r>
+      <w:r>
+        <w:rPr>
+          <w:rStyle w:val="OtherTok"/>
+        </w:rPr>
+        <w:t xml:space="preserve">&lt;-</w:t>
+      </w:r>
+      <w:r>
+        <w:rPr>
+          <w:rStyle w:val="NormalTok"/>
+        </w:rPr>
+        <w:t xml:space="preserve"> var_exp_infrastructures_dim[</w:t>
+      </w:r>
+      <w:r>
+        <w:rPr>
+          <w:rStyle w:val="DecValTok"/>
+        </w:rPr>
+        <w:t xml:space="preserve">2</w:t>
+      </w:r>
+      <w:r>
+        <w:rPr>
+          <w:rStyle w:val="NormalTok"/>
+        </w:rPr>
+        <w:t xml:space="preserve">] </w:t>
+      </w:r>
+      <w:r>
+        <w:br/>
+      </w:r>
+      <w:r>
+        <w:rPr>
+          <w:rStyle w:val="NormalTok"/>
+        </w:rPr>
+        <w:t xml:space="preserve">variance_PC3 </w:t>
+      </w:r>
+      <w:r>
+        <w:rPr>
+          <w:rStyle w:val="OtherTok"/>
+        </w:rPr>
+        <w:t xml:space="preserve">&lt;-</w:t>
+      </w:r>
+      <w:r>
+        <w:rPr>
+          <w:rStyle w:val="NormalTok"/>
+        </w:rPr>
+        <w:t xml:space="preserve"> var_exp_infrastructures_dim[</w:t>
+      </w:r>
+      <w:r>
+        <w:rPr>
+          <w:rStyle w:val="DecValTok"/>
+        </w:rPr>
+        <w:t xml:space="preserve">3</w:t>
+      </w:r>
+      <w:r>
+        <w:rPr>
+          <w:rStyle w:val="NormalTok"/>
+        </w:rPr>
+        <w:t xml:space="preserve">] </w:t>
+      </w:r>
+      <w:r>
+        <w:br/>
+      </w:r>
+      <w:r>
+        <w:br/>
+      </w:r>
+      <w:r>
+        <w:rPr>
+          <w:rStyle w:val="CommentTok"/>
+        </w:rPr>
+        <w:t xml:space="preserve"># Calculation of the weighted contribution for each indicator</w:t>
+      </w:r>
+      <w:r>
+        <w:br/>
+      </w:r>
+      <w:r>
+        <w:rPr>
+          <w:rStyle w:val="NormalTok"/>
+        </w:rPr>
+        <w:t xml:space="preserve">combined_weight_infrastructuresdim </w:t>
+      </w:r>
+      <w:r>
+        <w:rPr>
+          <w:rStyle w:val="OtherTok"/>
+        </w:rPr>
+        <w:t xml:space="preserve">&lt;-</w:t>
+      </w:r>
+      <w:r>
+        <w:rPr>
+          <w:rStyle w:val="NormalTok"/>
+        </w:rPr>
+        <w:t xml:space="preserve"> (weight_PC1_infrastructuresdim </w:t>
+      </w:r>
+      <w:r>
+        <w:rPr>
+          <w:rStyle w:val="SpecialCharTok"/>
+        </w:rPr>
+        <w:t xml:space="preserve">*</w:t>
+      </w:r>
+      <w:r>
+        <w:rPr>
+          <w:rStyle w:val="NormalTok"/>
+        </w:rPr>
+        <w:t xml:space="preserve"> variance_PC1 </w:t>
+      </w:r>
+      <w:r>
+        <w:rPr>
+          <w:rStyle w:val="SpecialCharTok"/>
+        </w:rPr>
+        <w:t xml:space="preserve">+</w:t>
+      </w:r>
+      <w:r>
+        <w:rPr>
+          <w:rStyle w:val="NormalTok"/>
+        </w:rPr>
+        <w:t xml:space="preserve"> </w:t>
+      </w:r>
+      <w:r>
+        <w:br/>
+      </w:r>
+      <w:r>
+        <w:rPr>
+          <w:rStyle w:val="NormalTok"/>
+        </w:rPr>
+        <w:t xml:space="preserve">                                  weight_PC2_infrastructuresdim </w:t>
+      </w:r>
+      <w:r>
+        <w:rPr>
+          <w:rStyle w:val="SpecialCharTok"/>
+        </w:rPr>
+        <w:t xml:space="preserve">*</w:t>
+      </w:r>
+      <w:r>
+        <w:rPr>
+          <w:rStyle w:val="NormalTok"/>
+        </w:rPr>
+        <w:t xml:space="preserve"> variance_PC2 </w:t>
+      </w:r>
+      <w:r>
+        <w:rPr>
+          <w:rStyle w:val="SpecialCharTok"/>
+        </w:rPr>
+        <w:t xml:space="preserve">+</w:t>
+      </w:r>
+      <w:r>
+        <w:br/>
+      </w:r>
+      <w:r>
+        <w:rPr>
+          <w:rStyle w:val="NormalTok"/>
+        </w:rPr>
+        <w:t xml:space="preserve">                                  weight_PC3_infrastructuresdim </w:t>
+      </w:r>
+      <w:r>
+        <w:rPr>
+          <w:rStyle w:val="SpecialCharTok"/>
+        </w:rPr>
+        <w:t xml:space="preserve">*</w:t>
+      </w:r>
+      <w:r>
+        <w:rPr>
+          <w:rStyle w:val="NormalTok"/>
+        </w:rPr>
+        <w:t xml:space="preserve"> variance_PC3)</w:t>
+      </w:r>
+      <w:r>
+        <w:br/>
+      </w:r>
+      <w:r>
+        <w:br/>
+      </w:r>
+      <w:r>
+        <w:rPr>
+          <w:rStyle w:val="CommentTok"/>
+        </w:rPr>
+        <w:t xml:space="preserve"># Normalise weights so they sum 1</w:t>
       </w:r>
       <w:r>
         <w:br/>
@@ -18462,7 +18848,7 @@
         <w:rPr>
           <w:rStyle w:val="NormalTok"/>
         </w:rPr>
-        <w:t xml:space="preserve"> pc1_weights </w:t>
+        <w:t xml:space="preserve"> combined_weight_infrastructuresdim </w:t>
       </w:r>
       <w:r>
         <w:rPr>
@@ -18486,10 +18872,19 @@
         <w:rPr>
           <w:rStyle w:val="NormalTok"/>
         </w:rPr>
-        <w:t xml:space="preserve">(pc1_weights)</w:t>
-      </w:r>
-      <w:r>
-        <w:br/>
+        <w:t xml:space="preserve">(combined_weight_infrastructuresdim)</w:t>
+      </w:r>
+      <w:r>
+        <w:br/>
+      </w:r>
+      <w:r>
+        <w:br/>
+      </w:r>
+      <w:r>
+        <w:rPr>
+          <w:rStyle w:val="CommentTok"/>
+        </w:rPr>
+        <w:t xml:space="preserve"># Show normalised weights</w:t>
       </w:r>
       <w:r>
         <w:br/>
@@ -18518,7 +18913,7 @@
         <w:rPr>
           <w:rStyle w:val="VerbatimChar"/>
         </w:rPr>
-        <w:t xml:space="preserve">##                              0.143691093 </w:t>
+        <w:t xml:space="preserve">##                               0.10099440 </w:t>
       </w:r>
       <w:r>
         <w:br/>
@@ -18536,7 +18931,7 @@
         <w:rPr>
           <w:rStyle w:val="VerbatimChar"/>
         </w:rPr>
-        <w:t xml:space="preserve">##                              0.180551363 </w:t>
+        <w:t xml:space="preserve">##                               0.12028696 </w:t>
       </w:r>
       <w:r>
         <w:br/>
@@ -18554,7 +18949,7 @@
         <w:rPr>
           <w:rStyle w:val="VerbatimChar"/>
         </w:rPr>
-        <w:t xml:space="preserve">##                              0.167580644 </w:t>
+        <w:t xml:space="preserve">##                               0.13068994 </w:t>
       </w:r>
       <w:r>
         <w:br/>
@@ -18572,7 +18967,7 @@
         <w:rPr>
           <w:rStyle w:val="VerbatimChar"/>
         </w:rPr>
-        <w:t xml:space="preserve">##                              0.080195075 </w:t>
+        <w:t xml:space="preserve">##                               0.06675639 </w:t>
       </w:r>
       <w:r>
         <w:br/>
@@ -18590,7 +18985,7 @@
         <w:rPr>
           <w:rStyle w:val="VerbatimChar"/>
         </w:rPr>
-        <w:t xml:space="preserve">##                              0.168834762 </w:t>
+        <w:t xml:space="preserve">##                               0.13578521 </w:t>
       </w:r>
       <w:r>
         <w:br/>
@@ -18608,7 +19003,7 @@
         <w:rPr>
           <w:rStyle w:val="VerbatimChar"/>
         </w:rPr>
-        <w:t xml:space="preserve">##                              0.067565967 </w:t>
+        <w:t xml:space="preserve">##                               0.10587020 </w:t>
       </w:r>
       <w:r>
         <w:br/>
@@ -18626,7 +19021,7 @@
         <w:rPr>
           <w:rStyle w:val="VerbatimChar"/>
         </w:rPr>
-        <w:t xml:space="preserve">##                              0.104959635 </w:t>
+        <w:t xml:space="preserve">##                               0.12963505 </w:t>
       </w:r>
       <w:r>
         <w:br/>
@@ -18644,7 +19039,7 @@
         <w:rPr>
           <w:rStyle w:val="VerbatimChar"/>
         </w:rPr>
-        <w:t xml:space="preserve">##                              0.007891121 </w:t>
+        <w:t xml:space="preserve">##                               0.08337370 </w:t>
       </w:r>
       <w:r>
         <w:br/>
@@ -18662,7 +19057,7 @@
         <w:rPr>
           <w:rStyle w:val="VerbatimChar"/>
         </w:rPr>
-        <w:t xml:space="preserve">##                              0.026506497 </w:t>
+        <w:t xml:space="preserve">##                               0.06448774 </w:t>
       </w:r>
       <w:r>
         <w:br/>
@@ -18680,7 +19075,7 @@
         <w:rPr>
           <w:rStyle w:val="VerbatimChar"/>
         </w:rPr>
-        <w:t xml:space="preserve">##                              0.052223841</w:t>
+        <w:t xml:space="preserve">##                               0.06212042</w:t>
       </w:r>
     </w:p>
     <w:p>
@@ -31685,52 +32080,52 @@
         <w:rPr>
           <w:rStyle w:val="VerbatimChar"/>
         </w:rPr>
-        <w:t xml:space="preserve">## 1         5.88 -0.891446092  0.46586706 -1.0138480    -0.29225767  0.081912393</w:t>
-      </w:r>
-      <w:r>
-        <w:br/>
-      </w:r>
-      <w:r>
-        <w:rPr>
-          <w:rStyle w:val="VerbatimChar"/>
-        </w:rPr>
-        <w:t xml:space="preserve">## 2         6.71 -0.321052794 -0.21827077 -0.4864620    -0.08996025 -0.160304877</w:t>
-      </w:r>
-      <w:r>
-        <w:br/>
-      </w:r>
-      <w:r>
-        <w:rPr>
-          <w:rStyle w:val="VerbatimChar"/>
-        </w:rPr>
-        <w:t xml:space="preserve">## 3         7.40 -0.278676033 -0.34076389 -0.7961988     0.02066545  0.106680625</w:t>
-      </w:r>
-      <w:r>
-        <w:br/>
-      </w:r>
-      <w:r>
-        <w:rPr>
-          <w:rStyle w:val="VerbatimChar"/>
-        </w:rPr>
-        <w:t xml:space="preserve">## 4         6.53  0.076399136  0.49643701 -0.6478019     0.84644879  0.007987994</w:t>
-      </w:r>
-      <w:r>
-        <w:br/>
-      </w:r>
-      <w:r>
-        <w:rPr>
-          <w:rStyle w:val="VerbatimChar"/>
-        </w:rPr>
-        <w:t xml:space="preserve">## 5         7.60 -0.004902845  0.09566967 -0.2203509     1.11298969  1.053773129</w:t>
-      </w:r>
-      <w:r>
-        <w:br/>
-      </w:r>
-      <w:r>
-        <w:rPr>
-          <w:rStyle w:val="VerbatimChar"/>
-        </w:rPr>
-        <w:t xml:space="preserve">## 6         7.77  0.208820045  0.25622133 -0.1653692     0.56416196  0.726660894</w:t>
+        <w:t xml:space="preserve">## 1         5.88 -0.891446092  0.46586706 -1.0138480    -0.13752154  0.081912393</w:t>
+      </w:r>
+      <w:r>
+        <w:br/>
+      </w:r>
+      <w:r>
+        <w:rPr>
+          <w:rStyle w:val="VerbatimChar"/>
+        </w:rPr>
+        <w:t xml:space="preserve">## 2         6.71 -0.321052794 -0.21827077 -0.4864620     0.11241131 -0.160304877</w:t>
+      </w:r>
+      <w:r>
+        <w:br/>
+      </w:r>
+      <w:r>
+        <w:rPr>
+          <w:rStyle w:val="VerbatimChar"/>
+        </w:rPr>
+        <w:t xml:space="preserve">## 3         7.40 -0.278676033 -0.34076389 -0.7961988     0.03924414  0.106680625</w:t>
+      </w:r>
+      <w:r>
+        <w:br/>
+      </w:r>
+      <w:r>
+        <w:rPr>
+          <w:rStyle w:val="VerbatimChar"/>
+        </w:rPr>
+        <w:t xml:space="preserve">## 4         6.53  0.076399136  0.49643701 -0.6478019     1.02209267  0.007987994</w:t>
+      </w:r>
+      <w:r>
+        <w:br/>
+      </w:r>
+      <w:r>
+        <w:rPr>
+          <w:rStyle w:val="VerbatimChar"/>
+        </w:rPr>
+        <w:t xml:space="preserve">## 5         7.60 -0.004902845  0.09566967 -0.2203509     1.02361403  1.053773129</w:t>
+      </w:r>
+      <w:r>
+        <w:br/>
+      </w:r>
+      <w:r>
+        <w:rPr>
+          <w:rStyle w:val="VerbatimChar"/>
+        </w:rPr>
+        <w:t xml:space="preserve">## 6         7.77  0.208820045  0.25622133 -0.1653692     0.40299452  0.726660894</w:t>
       </w:r>
       <w:r>
         <w:br/>
@@ -31812,7 +32207,7 @@
         <w:rPr>
           <w:rStyle w:val="FunctionTok"/>
         </w:rPr>
-        <w:t xml:space="preserve">write.csv</w:t>
+        <w:t xml:space="preserve">write.csv2</w:t>
       </w:r>
       <w:r>
         <w:rPr>
@@ -31827,7 +32222,7 @@
         <w:rPr>
           <w:rStyle w:val="NormalTok"/>
         </w:rPr>
-        <w:t xml:space="preserve">          </w:t>
+        <w:t xml:space="preserve">           </w:t>
       </w:r>
       <w:r>
         <w:rPr>
@@ -31908,7 +32303,7 @@
         <w:rPr>
           <w:rStyle w:val="NormalTok"/>
         </w:rPr>
-        <w:t xml:space="preserve">          </w:t>
+        <w:t xml:space="preserve">           </w:t>
       </w:r>
       <w:r>
         <w:rPr>
@@ -31941,7 +32336,7 @@
         <w:rPr>
           <w:rStyle w:val="NormalTok"/>
         </w:rPr>
-        <w:t xml:space="preserve">          </w:t>
+        <w:t xml:space="preserve">           </w:t>
       </w:r>
       <w:r>
         <w:rPr>

</xml_diff>